<commit_message>
Fig 3-3: plot the porosity coefficient (e = P_m^2), not the mass factor; add bilingual code-fix history docs
Chapter-3 porosity schematic previously plotted P_m = rho/rho_s (the mass
factor). Per the thesis's own eq. 3-39/3-40..3-44, the POROSITY coefficient
e_i is distinct from the mass coefficient e_mi (e = P_m^2 pointwise for every
pattern) -- switch the schematic to plot that instead, relabel the axis, and
widen the y-range to fit the V/A peaks (up to ~2 unclipped).

Also add CODE_FIX_HISTORY_EN/FA.md(+docx): an evidence-based explanation of
the 4 fatal bugs in the author's original New Cods/Main_Dyn.m..R4 dynamic
solver (undefined C23 crash, Newmark displacement-form result misused as
acceleration, backwards stiffness-matrix sign, fabricated 2*pi*r*dr*dz mass
volume factor) and exactly what claude_R1.m changed to fix each one, with
direct line-cited code comparisons.

Co-Authored-By: Claude Sonnet 5 <noreply@anthropic.com>
</commit_message>
<xml_diff>
--- a/claude/thesis_chapter/CHAPTER3_formulation_FA_R1.docx
+++ b/claude/thesis_chapter/CHAPTER3_formulation_FA_R1.docx
@@ -1301,7 +1301,7 @@
       <w:r>
         <w:drawing>
           <wp:inline>
-            <wp:extent cx="5334000" cy="2834956"/>
+            <wp:extent cx="5334000" cy="2810407"/>
             <wp:effectExtent b="0" l="0" r="0" t="0"/>
             <wp:docPr descr="شکل ۳-۱" title="" id="10" name="Picture"/>
             <a:graphic>
@@ -1322,7 +1322,7 @@
                   <pic:spPr bwMode="auto">
                     <a:xfrm>
                       <a:off x="0" y="0"/>
-                      <a:ext cx="5334000" cy="2834956"/>
+                      <a:ext cx="5334000" cy="2810407"/>
                     </a:xfrm>
                     <a:prstGeom prst="rect">
                       <a:avLst/>
@@ -12197,7 +12197,7 @@
       <w:r>
         <w:drawing>
           <wp:inline>
-            <wp:extent cx="5334000" cy="3661426"/>
+            <wp:extent cx="5334000" cy="3609964"/>
             <wp:effectExtent b="0" l="0" r="0" t="0"/>
             <wp:docPr descr="شکل ۳-۳" title="" id="18" name="Picture"/>
             <a:graphic>
@@ -12218,7 +12218,7 @@
                   <pic:spPr bwMode="auto">
                     <a:xfrm>
                       <a:off x="0" y="0"/>
-                      <a:ext cx="5334000" cy="3661426"/>
+                      <a:ext cx="5334000" cy="3609964"/>
                     </a:xfrm>
                     <a:prstGeom prst="rect">
                       <a:avLst/>

</xml_diff>